<commit_message>
Sat, Dec  6, 2025  7:19:05 PM
</commit_message>
<xml_diff>
--- a/assets/publishing/RIFT_WORLDS_The_Genesis.docx
+++ b/assets/publishing/RIFT_WORLDS_The_Genesis.docx
@@ -24,6 +24,15 @@
           <w:bCs/>
         </w:rPr>
       </w:pPr>
+      <w:r>
+        <w:rPr>
+          <w:b/>
+          <w:bCs/>
+          <w:i/>
+          <w:iCs/>
+        </w:rPr>
+        <w:t xml:space="preserve">Book 1: </w:t>
+      </w:r>
       <w:r>
         <w:rPr>
           <w:b/>
@@ -68,13 +77,29 @@
       </w:r>
       <w:proofErr w:type="spellEnd"/>
       <w:r>
-        <w:t xml:space="preserve"> was a place without visitors. Its dunes drifted in slow tides, hiding old caravan tracks and burying the bones of forgotten travelers. Only the wind crossed it—soft, dry, unchanging. But on a night toward the height of Alexandria’s great Library, something else moved beneath the sand.</w:t>
+        <w:t xml:space="preserve"> was a place without visitors. Its dunes drifted in slow tides, hiding old caravan tracks and burying the bones of forgotten travelers. Only the wind </w:t>
+      </w:r>
+      <w:proofErr w:type="gramStart"/>
+      <w:r>
+        <w:t>crossed it—</w:t>
+      </w:r>
+      <w:proofErr w:type="gramEnd"/>
+      <w:r>
+        <w:t>soft, dry, unchanging. But on a night toward the height of Alexandria’s great Library, something else moved beneath the sand.</w:t>
       </w:r>
     </w:p>
     <w:p/>
     <w:p>
       <w:r>
-        <w:t>Kleon of Cyrene came in pursuit of unusual pulses reported by shepherds who did not understand what they had walked across. He expected tricks of heat or distance, nothing more. Still, he had a habit of listening for patterns others overlooked.</w:t>
+        <w:t xml:space="preserve">Kleon of Cyrene came in pursuit of unusual pulses reported by shepherds who did not understand what they had walked across. He expected tricks of heat or distance, nothing more. Still, he had a habit of listening </w:t>
+      </w:r>
+      <w:proofErr w:type="gramStart"/>
+      <w:r>
+        <w:t>for</w:t>
+      </w:r>
+      <w:proofErr w:type="gramEnd"/>
+      <w:r>
+        <w:t xml:space="preserve"> patterns others overlooked.</w:t>
       </w:r>
     </w:p>
     <w:p/>
@@ -97,7 +122,15 @@
     </w:p>
     <w:p>
       <w:r>
-        <w:t>As night settled, the stars seemed to lean inward—not brighter, just closer, as though the sky had gained an unfamiliar depth. The usual desert sounds quieted. Even the insects withdrew into the sand.</w:t>
+        <w:t xml:space="preserve">As night settled, the stars seemed to lean inward—not brighter, just closer, as though the sky had gained an unfamiliar depth. The usual desert sounds </w:t>
+      </w:r>
+      <w:proofErr w:type="gramStart"/>
+      <w:r>
+        <w:t>quieted</w:t>
+      </w:r>
+      <w:proofErr w:type="gramEnd"/>
+      <w:r>
+        <w:t>. Even the insects withdrew into the sand.</w:t>
       </w:r>
     </w:p>
     <w:p/>
@@ -109,7 +142,11 @@
     <w:p/>
     <w:p>
       <w:r>
-        <w:t xml:space="preserve">A narrow shimmer appeared in the open air, a thread of pale light standing upright where nothing ought to be. It did not burst forth or tear reality open. It simply </w:t>
+        <w:t xml:space="preserve">A narrow shimmer appeared in the open air, a thread of pale light standing upright where nothing ought to be. It did not burst forth or tear reality open. It </w:t>
+      </w:r>
+      <w:proofErr w:type="gramStart"/>
+      <w:r>
+        <w:t xml:space="preserve">simply </w:t>
       </w:r>
       <w:r>
         <w:rPr>
@@ -119,7 +156,19 @@
         <w:t>was</w:t>
       </w:r>
       <w:r>
-        <w:t>, a line too straight to be accidental. The glow wavered, steadied, and remained—a boundary that did not yet know what it intended to become.</w:t>
+        <w:t>,</w:t>
+      </w:r>
+      <w:proofErr w:type="gramEnd"/>
+      <w:r>
+        <w:t xml:space="preserve"> a line too straight to be accidental. The glow wavered, steadied, and remained—a boundary </w:t>
+      </w:r>
+      <w:proofErr w:type="gramStart"/>
+      <w:r>
+        <w:t>that</w:t>
+      </w:r>
+      <w:proofErr w:type="gramEnd"/>
+      <w:r>
+        <w:t xml:space="preserve"> did not yet know what it intended to become.</w:t>
       </w:r>
     </w:p>
     <w:p>
@@ -152,7 +201,15 @@
     </w:p>
     <w:p>
       <w:r>
-        <w:t>The pale line pulsed once.</w:t>
+        <w:t xml:space="preserve">The pale line </w:t>
+      </w:r>
+      <w:proofErr w:type="gramStart"/>
+      <w:r>
+        <w:t>pulsed</w:t>
+      </w:r>
+      <w:proofErr w:type="gramEnd"/>
+      <w:r>
+        <w:t xml:space="preserve"> once.</w:t>
       </w:r>
     </w:p>
     <w:p/>
@@ -182,9 +239,51 @@
     <w:p/>
     <w:p>
       <w:r>
-        <w:t>And somewhere far behind him, beneath the heat of the waking sun, the first rift continued its patient formation—beginning the long transformation that would someday connect Terra to countless others across the unseen lattice of the Rift Worlds.</w:t>
+        <w:t>And somewhere far behind him, beneath the heat of the waking sun, the first rift continued its patient formation—beginning the long transformation that would someday connect Terra to countless other</w:t>
+      </w:r>
+      <w:r>
+        <w:t xml:space="preserve"> worlds</w:t>
+      </w:r>
+      <w:r>
+        <w:t xml:space="preserve"> across the unseen lattice of the </w:t>
+      </w:r>
+      <w:r>
+        <w:t>rift network</w:t>
+      </w:r>
+      <w:r>
+        <w:t>.</w:t>
       </w:r>
     </w:p>
+    <w:p/>
+    <w:p/>
+    <w:p>
+      <w:pPr>
+        <w:rPr>
+          <w:i/>
+          <w:iCs/>
+        </w:rPr>
+      </w:pPr>
+      <w:r>
+        <w:rPr>
+          <w:i/>
+          <w:iCs/>
+        </w:rPr>
+        <w:t>Coming soon…</w:t>
+      </w:r>
+    </w:p>
+    <w:p>
+      <w:r>
+        <w:t xml:space="preserve">RIFT WORLDS - Book 2: </w:t>
+      </w:r>
+      <w:r>
+        <w:rPr>
+          <w:i/>
+          <w:iCs/>
+        </w:rPr>
+        <w:t>The Vision</w:t>
+      </w:r>
+    </w:p>
+    <w:p/>
     <w:p>
       <w:r>
         <w:br w:type="page"/>
@@ -2495,6 +2594,7 @@
   <w:style w:type="character" w:default="1" w:styleId="DefaultParagraphFont">
     <w:name w:val="Default Paragraph Font"/>
     <w:uiPriority w:val="1"/>
+    <w:semiHidden/>
     <w:unhideWhenUsed/>
   </w:style>
   <w:style w:type="table" w:default="1" w:styleId="TableNormal">
@@ -3567,139 +3667,12 @@
 </file>
 
 <file path=customXml/item1.xml><?xml version="1.0" encoding="utf-8"?>
-<p:properties xmlns:p="http://schemas.microsoft.com/office/2006/metadata/properties" xmlns:xsi="http://www.w3.org/2001/XMLSchema-instance" xmlns:pc="http://schemas.microsoft.com/office/infopath/2007/PartnerControls">
-  <documentManagement>
-    <LocLastLocAttemptVersionTypeLookup xmlns="4873beb7-5857-4685-be1f-d57550cc96cc" xsi:nil="true"/>
-    <MarketSpecific xmlns="4873beb7-5857-4685-be1f-d57550cc96cc">false</MarketSpecific>
-    <ApprovalStatus xmlns="4873beb7-5857-4685-be1f-d57550cc96cc">InProgress</ApprovalStatus>
-    <LocComments xmlns="4873beb7-5857-4685-be1f-d57550cc96cc" xsi:nil="true"/>
-    <DirectSourceMarket xmlns="4873beb7-5857-4685-be1f-d57550cc96cc" xsi:nil="true"/>
-    <LocPublishedLinkedAssetsLookup xmlns="4873beb7-5857-4685-be1f-d57550cc96cc" xsi:nil="true"/>
-    <ThumbnailAssetId xmlns="4873beb7-5857-4685-be1f-d57550cc96cc" xsi:nil="true"/>
-    <PrimaryImageGen xmlns="4873beb7-5857-4685-be1f-d57550cc96cc">true</PrimaryImageGen>
-    <LegacyData xmlns="4873beb7-5857-4685-be1f-d57550cc96cc" xsi:nil="true"/>
-    <LocNewPublishedVersionLookup xmlns="4873beb7-5857-4685-be1f-d57550cc96cc" xsi:nil="true"/>
-    <NumericId xmlns="4873beb7-5857-4685-be1f-d57550cc96cc">102787001</NumericId>
-    <TPFriendlyName xmlns="4873beb7-5857-4685-be1f-d57550cc96cc" xsi:nil="true"/>
-    <LocOverallPublishStatusLookup xmlns="4873beb7-5857-4685-be1f-d57550cc96cc" xsi:nil="true"/>
-    <LocRecommendedHandoff xmlns="4873beb7-5857-4685-be1f-d57550cc96cc" xsi:nil="true"/>
-    <BlockPublish xmlns="4873beb7-5857-4685-be1f-d57550cc96cc">false</BlockPublish>
-    <BusinessGroup xmlns="4873beb7-5857-4685-be1f-d57550cc96cc" xsi:nil="true"/>
-    <OpenTemplate xmlns="4873beb7-5857-4685-be1f-d57550cc96cc">true</OpenTemplate>
-    <SourceTitle xmlns="4873beb7-5857-4685-be1f-d57550cc96cc" xsi:nil="true"/>
-    <LocOverallLocStatusLookup xmlns="4873beb7-5857-4685-be1f-d57550cc96cc" xsi:nil="true"/>
-    <APEditor xmlns="4873beb7-5857-4685-be1f-d57550cc96cc">
-      <UserInfo>
-        <DisplayName/>
-        <AccountId xsi:nil="true"/>
-        <AccountType/>
-      </UserInfo>
-    </APEditor>
-    <UALocComments xmlns="4873beb7-5857-4685-be1f-d57550cc96cc" xsi:nil="true"/>
-    <IntlLangReviewDate xmlns="4873beb7-5857-4685-be1f-d57550cc96cc" xsi:nil="true"/>
-    <PublishStatusLookup xmlns="4873beb7-5857-4685-be1f-d57550cc96cc">
-      <Value>1343188</Value>
-    </PublishStatusLookup>
-    <ParentAssetId xmlns="4873beb7-5857-4685-be1f-d57550cc96cc" xsi:nil="true"/>
-    <FeatureTagsTaxHTField0 xmlns="4873beb7-5857-4685-be1f-d57550cc96cc">
-      <Terms xmlns="http://schemas.microsoft.com/office/infopath/2007/PartnerControls"/>
-    </FeatureTagsTaxHTField0>
-    <MachineTranslated xmlns="4873beb7-5857-4685-be1f-d57550cc96cc">false</MachineTranslated>
-    <Providers xmlns="4873beb7-5857-4685-be1f-d57550cc96cc" xsi:nil="true"/>
-    <OriginalSourceMarket xmlns="4873beb7-5857-4685-be1f-d57550cc96cc" xsi:nil="true"/>
-    <APDescription xmlns="4873beb7-5857-4685-be1f-d57550cc96cc" xsi:nil="true"/>
-    <ContentItem xmlns="4873beb7-5857-4685-be1f-d57550cc96cc" xsi:nil="true"/>
-    <ClipArtFilename xmlns="4873beb7-5857-4685-be1f-d57550cc96cc" xsi:nil="true"/>
-    <TPInstallLocation xmlns="4873beb7-5857-4685-be1f-d57550cc96cc" xsi:nil="true"/>
-    <TimesCloned xmlns="4873beb7-5857-4685-be1f-d57550cc96cc" xsi:nil="true"/>
-    <PublishTargets xmlns="4873beb7-5857-4685-be1f-d57550cc96cc">OfficeOnlineVNext</PublishTargets>
-    <AcquiredFrom xmlns="4873beb7-5857-4685-be1f-d57550cc96cc">Internal MS</AcquiredFrom>
-    <AssetStart xmlns="4873beb7-5857-4685-be1f-d57550cc96cc">2011-11-23T17:29:00+00:00</AssetStart>
-    <FriendlyTitle xmlns="4873beb7-5857-4685-be1f-d57550cc96cc" xsi:nil="true"/>
-    <Provider xmlns="4873beb7-5857-4685-be1f-d57550cc96cc" xsi:nil="true"/>
-    <LastHandOff xmlns="4873beb7-5857-4685-be1f-d57550cc96cc" xsi:nil="true"/>
-    <TPClientViewer xmlns="4873beb7-5857-4685-be1f-d57550cc96cc" xsi:nil="true"/>
-    <TemplateStatus xmlns="4873beb7-5857-4685-be1f-d57550cc96cc">Complete</TemplateStatus>
-    <Downloads xmlns="4873beb7-5857-4685-be1f-d57550cc96cc">0</Downloads>
-    <OOCacheId xmlns="4873beb7-5857-4685-be1f-d57550cc96cc" xsi:nil="true"/>
-    <IsDeleted xmlns="4873beb7-5857-4685-be1f-d57550cc96cc">false</IsDeleted>
-    <LocPublishedDependentAssetsLookup xmlns="4873beb7-5857-4685-be1f-d57550cc96cc" xsi:nil="true"/>
-    <AssetExpire xmlns="4873beb7-5857-4685-be1f-d57550cc96cc">2029-05-12T07:00:00+00:00</AssetExpire>
-    <CSXSubmissionMarket xmlns="4873beb7-5857-4685-be1f-d57550cc96cc" xsi:nil="true"/>
-    <DSATActionTaken xmlns="4873beb7-5857-4685-be1f-d57550cc96cc" xsi:nil="true"/>
-    <SubmitterId xmlns="4873beb7-5857-4685-be1f-d57550cc96cc" xsi:nil="true"/>
-    <EditorialTags xmlns="4873beb7-5857-4685-be1f-d57550cc96cc" xsi:nil="true"/>
-    <TPExecutable xmlns="4873beb7-5857-4685-be1f-d57550cc96cc" xsi:nil="true"/>
-    <CSXSubmissionDate xmlns="4873beb7-5857-4685-be1f-d57550cc96cc" xsi:nil="true"/>
-    <CSXUpdate xmlns="4873beb7-5857-4685-be1f-d57550cc96cc">false</CSXUpdate>
-    <AssetType xmlns="4873beb7-5857-4685-be1f-d57550cc96cc">TP</AssetType>
-    <ApprovalLog xmlns="4873beb7-5857-4685-be1f-d57550cc96cc" xsi:nil="true"/>
-    <BugNumber xmlns="4873beb7-5857-4685-be1f-d57550cc96cc" xsi:nil="true"/>
-    <OriginAsset xmlns="4873beb7-5857-4685-be1f-d57550cc96cc" xsi:nil="true"/>
-    <TPComponent xmlns="4873beb7-5857-4685-be1f-d57550cc96cc" xsi:nil="true"/>
-    <Milestone xmlns="4873beb7-5857-4685-be1f-d57550cc96cc" xsi:nil="true"/>
-    <RecommendationsModifier xmlns="4873beb7-5857-4685-be1f-d57550cc96cc" xsi:nil="true"/>
-    <AssetId xmlns="4873beb7-5857-4685-be1f-d57550cc96cc">TP102787001</AssetId>
-    <PolicheckWords xmlns="4873beb7-5857-4685-be1f-d57550cc96cc" xsi:nil="true"/>
-    <TPLaunchHelpLink xmlns="4873beb7-5857-4685-be1f-d57550cc96cc" xsi:nil="true"/>
-    <IntlLocPriority xmlns="4873beb7-5857-4685-be1f-d57550cc96cc" xsi:nil="true"/>
-    <TPApplication xmlns="4873beb7-5857-4685-be1f-d57550cc96cc" xsi:nil="true"/>
-    <IntlLangReviewer xmlns="4873beb7-5857-4685-be1f-d57550cc96cc" xsi:nil="true"/>
-    <HandoffToMSDN xmlns="4873beb7-5857-4685-be1f-d57550cc96cc" xsi:nil="true"/>
-    <PlannedPubDate xmlns="4873beb7-5857-4685-be1f-d57550cc96cc" xsi:nil="true"/>
-    <CrawlForDependencies xmlns="4873beb7-5857-4685-be1f-d57550cc96cc">false</CrawlForDependencies>
-    <LocLastLocAttemptVersionLookup xmlns="4873beb7-5857-4685-be1f-d57550cc96cc">693888</LocLastLocAttemptVersionLookup>
-    <LocProcessedForHandoffsLookup xmlns="4873beb7-5857-4685-be1f-d57550cc96cc" xsi:nil="true"/>
-    <TrustLevel xmlns="4873beb7-5857-4685-be1f-d57550cc96cc">1 Microsoft Managed Content</TrustLevel>
-    <CampaignTagsTaxHTField0 xmlns="4873beb7-5857-4685-be1f-d57550cc96cc">
-      <Terms xmlns="http://schemas.microsoft.com/office/infopath/2007/PartnerControls"/>
-    </CampaignTagsTaxHTField0>
-    <TPNamespace xmlns="4873beb7-5857-4685-be1f-d57550cc96cc" xsi:nil="true"/>
-    <LocOverallPreviewStatusLookup xmlns="4873beb7-5857-4685-be1f-d57550cc96cc" xsi:nil="true"/>
-    <TaxCatchAll xmlns="4873beb7-5857-4685-be1f-d57550cc96cc"/>
-    <IsSearchable xmlns="4873beb7-5857-4685-be1f-d57550cc96cc">false</IsSearchable>
-    <TemplateTemplateType xmlns="4873beb7-5857-4685-be1f-d57550cc96cc">Word Document Template</TemplateTemplateType>
-    <Markets xmlns="4873beb7-5857-4685-be1f-d57550cc96cc"/>
-    <IntlLangReview xmlns="4873beb7-5857-4685-be1f-d57550cc96cc" xsi:nil="true"/>
-    <UAProjectedTotalWords xmlns="4873beb7-5857-4685-be1f-d57550cc96cc" xsi:nil="true"/>
-    <OutputCachingOn xmlns="4873beb7-5857-4685-be1f-d57550cc96cc">false</OutputCachingOn>
-    <AverageRating xmlns="4873beb7-5857-4685-be1f-d57550cc96cc" xsi:nil="true"/>
-    <LocMarketGroupTiers2 xmlns="4873beb7-5857-4685-be1f-d57550cc96cc" xsi:nil="true"/>
-    <APAuthor xmlns="4873beb7-5857-4685-be1f-d57550cc96cc">
-      <UserInfo>
-        <DisplayName>REDMOND\v-namall</DisplayName>
-        <AccountId>978</AccountId>
-        <AccountType/>
-      </UserInfo>
-    </APAuthor>
-    <TPCommandLine xmlns="4873beb7-5857-4685-be1f-d57550cc96cc" xsi:nil="true"/>
-    <LocManualTestRequired xmlns="4873beb7-5857-4685-be1f-d57550cc96cc">false</LocManualTestRequired>
-    <TPAppVersion xmlns="4873beb7-5857-4685-be1f-d57550cc96cc" xsi:nil="true"/>
-    <EditorialStatus xmlns="4873beb7-5857-4685-be1f-d57550cc96cc">Complete</EditorialStatus>
-    <LocProcessedForMarketsLookup xmlns="4873beb7-5857-4685-be1f-d57550cc96cc" xsi:nil="true"/>
-    <LastModifiedDateTime xmlns="4873beb7-5857-4685-be1f-d57550cc96cc" xsi:nil="true"/>
-    <TPLaunchHelpLinkType xmlns="4873beb7-5857-4685-be1f-d57550cc96cc">Template</TPLaunchHelpLinkType>
-    <ScenarioTagsTaxHTField0 xmlns="4873beb7-5857-4685-be1f-d57550cc96cc">
-      <Terms xmlns="http://schemas.microsoft.com/office/infopath/2007/PartnerControls"/>
-    </ScenarioTagsTaxHTField0>
-    <OriginalRelease xmlns="4873beb7-5857-4685-be1f-d57550cc96cc">14</OriginalRelease>
-    <LocalizationTagsTaxHTField0 xmlns="4873beb7-5857-4685-be1f-d57550cc96cc">
-      <Terms xmlns="http://schemas.microsoft.com/office/infopath/2007/PartnerControls"/>
-    </LocalizationTagsTaxHTField0>
-    <Manager xmlns="4873beb7-5857-4685-be1f-d57550cc96cc" xsi:nil="true"/>
-    <UALocRecommendation xmlns="4873beb7-5857-4685-be1f-d57550cc96cc">Localize</UALocRecommendation>
-    <LocOverallHandbackStatusLookup xmlns="4873beb7-5857-4685-be1f-d57550cc96cc" xsi:nil="true"/>
-    <ArtSampleDocs xmlns="4873beb7-5857-4685-be1f-d57550cc96cc" xsi:nil="true"/>
-    <UACurrentWords xmlns="4873beb7-5857-4685-be1f-d57550cc96cc" xsi:nil="true"/>
-    <ShowIn xmlns="4873beb7-5857-4685-be1f-d57550cc96cc">Show everywhere</ShowIn>
-    <CSXHash xmlns="4873beb7-5857-4685-be1f-d57550cc96cc" xsi:nil="true"/>
-    <VoteCount xmlns="4873beb7-5857-4685-be1f-d57550cc96cc" xsi:nil="true"/>
-    <InternalTagsTaxHTField0 xmlns="4873beb7-5857-4685-be1f-d57550cc96cc">
-      <Terms xmlns="http://schemas.microsoft.com/office/infopath/2007/PartnerControls"/>
-    </InternalTagsTaxHTField0>
-    <UANotes xmlns="4873beb7-5857-4685-be1f-d57550cc96cc" xsi:nil="true"/>
-  </documentManagement>
-</p:properties>
+<?mso-contentType ?>
+<FormTemplates xmlns="http://schemas.microsoft.com/sharepoint/v3/contenttype/forms">
+  <Display>DocumentLibraryForm</Display>
+  <Edit>AssetEditForm</Edit>
+  <New>DocumentLibraryForm</New>
+</FormTemplates>
 </file>
 
 <file path=customXml/item2.xml><?xml version="1.0" encoding="utf-8"?>
@@ -4743,20 +4716,145 @@
 </file>
 
 <file path=customXml/item3.xml><?xml version="1.0" encoding="utf-8"?>
-<?mso-contentType ?>
-<FormTemplates xmlns="http://schemas.microsoft.com/sharepoint/v3/contenttype/forms">
-  <Display>DocumentLibraryForm</Display>
-  <Edit>AssetEditForm</Edit>
-  <New>DocumentLibraryForm</New>
-</FormTemplates>
+<p:properties xmlns:p="http://schemas.microsoft.com/office/2006/metadata/properties" xmlns:xsi="http://www.w3.org/2001/XMLSchema-instance" xmlns:pc="http://schemas.microsoft.com/office/infopath/2007/PartnerControls">
+  <documentManagement>
+    <LocLastLocAttemptVersionTypeLookup xmlns="4873beb7-5857-4685-be1f-d57550cc96cc" xsi:nil="true"/>
+    <MarketSpecific xmlns="4873beb7-5857-4685-be1f-d57550cc96cc">false</MarketSpecific>
+    <ApprovalStatus xmlns="4873beb7-5857-4685-be1f-d57550cc96cc">InProgress</ApprovalStatus>
+    <LocComments xmlns="4873beb7-5857-4685-be1f-d57550cc96cc" xsi:nil="true"/>
+    <DirectSourceMarket xmlns="4873beb7-5857-4685-be1f-d57550cc96cc" xsi:nil="true"/>
+    <LocPublishedLinkedAssetsLookup xmlns="4873beb7-5857-4685-be1f-d57550cc96cc" xsi:nil="true"/>
+    <ThumbnailAssetId xmlns="4873beb7-5857-4685-be1f-d57550cc96cc" xsi:nil="true"/>
+    <PrimaryImageGen xmlns="4873beb7-5857-4685-be1f-d57550cc96cc">true</PrimaryImageGen>
+    <LegacyData xmlns="4873beb7-5857-4685-be1f-d57550cc96cc" xsi:nil="true"/>
+    <LocNewPublishedVersionLookup xmlns="4873beb7-5857-4685-be1f-d57550cc96cc" xsi:nil="true"/>
+    <NumericId xmlns="4873beb7-5857-4685-be1f-d57550cc96cc">102787001</NumericId>
+    <TPFriendlyName xmlns="4873beb7-5857-4685-be1f-d57550cc96cc" xsi:nil="true"/>
+    <LocOverallPublishStatusLookup xmlns="4873beb7-5857-4685-be1f-d57550cc96cc" xsi:nil="true"/>
+    <LocRecommendedHandoff xmlns="4873beb7-5857-4685-be1f-d57550cc96cc" xsi:nil="true"/>
+    <BlockPublish xmlns="4873beb7-5857-4685-be1f-d57550cc96cc">false</BlockPublish>
+    <BusinessGroup xmlns="4873beb7-5857-4685-be1f-d57550cc96cc" xsi:nil="true"/>
+    <OpenTemplate xmlns="4873beb7-5857-4685-be1f-d57550cc96cc">true</OpenTemplate>
+    <SourceTitle xmlns="4873beb7-5857-4685-be1f-d57550cc96cc" xsi:nil="true"/>
+    <LocOverallLocStatusLookup xmlns="4873beb7-5857-4685-be1f-d57550cc96cc" xsi:nil="true"/>
+    <APEditor xmlns="4873beb7-5857-4685-be1f-d57550cc96cc">
+      <UserInfo>
+        <DisplayName/>
+        <AccountId xsi:nil="true"/>
+        <AccountType/>
+      </UserInfo>
+    </APEditor>
+    <UALocComments xmlns="4873beb7-5857-4685-be1f-d57550cc96cc" xsi:nil="true"/>
+    <IntlLangReviewDate xmlns="4873beb7-5857-4685-be1f-d57550cc96cc" xsi:nil="true"/>
+    <PublishStatusLookup xmlns="4873beb7-5857-4685-be1f-d57550cc96cc">
+      <Value>1343188</Value>
+    </PublishStatusLookup>
+    <ParentAssetId xmlns="4873beb7-5857-4685-be1f-d57550cc96cc" xsi:nil="true"/>
+    <FeatureTagsTaxHTField0 xmlns="4873beb7-5857-4685-be1f-d57550cc96cc">
+      <Terms xmlns="http://schemas.microsoft.com/office/infopath/2007/PartnerControls"/>
+    </FeatureTagsTaxHTField0>
+    <MachineTranslated xmlns="4873beb7-5857-4685-be1f-d57550cc96cc">false</MachineTranslated>
+    <Providers xmlns="4873beb7-5857-4685-be1f-d57550cc96cc" xsi:nil="true"/>
+    <OriginalSourceMarket xmlns="4873beb7-5857-4685-be1f-d57550cc96cc" xsi:nil="true"/>
+    <APDescription xmlns="4873beb7-5857-4685-be1f-d57550cc96cc" xsi:nil="true"/>
+    <ContentItem xmlns="4873beb7-5857-4685-be1f-d57550cc96cc" xsi:nil="true"/>
+    <ClipArtFilename xmlns="4873beb7-5857-4685-be1f-d57550cc96cc" xsi:nil="true"/>
+    <TPInstallLocation xmlns="4873beb7-5857-4685-be1f-d57550cc96cc" xsi:nil="true"/>
+    <TimesCloned xmlns="4873beb7-5857-4685-be1f-d57550cc96cc" xsi:nil="true"/>
+    <PublishTargets xmlns="4873beb7-5857-4685-be1f-d57550cc96cc">OfficeOnlineVNext</PublishTargets>
+    <AcquiredFrom xmlns="4873beb7-5857-4685-be1f-d57550cc96cc">Internal MS</AcquiredFrom>
+    <AssetStart xmlns="4873beb7-5857-4685-be1f-d57550cc96cc">2011-11-23T17:29:00+00:00</AssetStart>
+    <FriendlyTitle xmlns="4873beb7-5857-4685-be1f-d57550cc96cc" xsi:nil="true"/>
+    <Provider xmlns="4873beb7-5857-4685-be1f-d57550cc96cc" xsi:nil="true"/>
+    <LastHandOff xmlns="4873beb7-5857-4685-be1f-d57550cc96cc" xsi:nil="true"/>
+    <TPClientViewer xmlns="4873beb7-5857-4685-be1f-d57550cc96cc" xsi:nil="true"/>
+    <TemplateStatus xmlns="4873beb7-5857-4685-be1f-d57550cc96cc">Complete</TemplateStatus>
+    <Downloads xmlns="4873beb7-5857-4685-be1f-d57550cc96cc">0</Downloads>
+    <OOCacheId xmlns="4873beb7-5857-4685-be1f-d57550cc96cc" xsi:nil="true"/>
+    <IsDeleted xmlns="4873beb7-5857-4685-be1f-d57550cc96cc">false</IsDeleted>
+    <LocPublishedDependentAssetsLookup xmlns="4873beb7-5857-4685-be1f-d57550cc96cc" xsi:nil="true"/>
+    <AssetExpire xmlns="4873beb7-5857-4685-be1f-d57550cc96cc">2029-05-12T07:00:00+00:00</AssetExpire>
+    <CSXSubmissionMarket xmlns="4873beb7-5857-4685-be1f-d57550cc96cc" xsi:nil="true"/>
+    <DSATActionTaken xmlns="4873beb7-5857-4685-be1f-d57550cc96cc" xsi:nil="true"/>
+    <SubmitterId xmlns="4873beb7-5857-4685-be1f-d57550cc96cc" xsi:nil="true"/>
+    <EditorialTags xmlns="4873beb7-5857-4685-be1f-d57550cc96cc" xsi:nil="true"/>
+    <TPExecutable xmlns="4873beb7-5857-4685-be1f-d57550cc96cc" xsi:nil="true"/>
+    <CSXSubmissionDate xmlns="4873beb7-5857-4685-be1f-d57550cc96cc" xsi:nil="true"/>
+    <CSXUpdate xmlns="4873beb7-5857-4685-be1f-d57550cc96cc">false</CSXUpdate>
+    <AssetType xmlns="4873beb7-5857-4685-be1f-d57550cc96cc">TP</AssetType>
+    <ApprovalLog xmlns="4873beb7-5857-4685-be1f-d57550cc96cc" xsi:nil="true"/>
+    <BugNumber xmlns="4873beb7-5857-4685-be1f-d57550cc96cc" xsi:nil="true"/>
+    <OriginAsset xmlns="4873beb7-5857-4685-be1f-d57550cc96cc" xsi:nil="true"/>
+    <TPComponent xmlns="4873beb7-5857-4685-be1f-d57550cc96cc" xsi:nil="true"/>
+    <Milestone xmlns="4873beb7-5857-4685-be1f-d57550cc96cc" xsi:nil="true"/>
+    <RecommendationsModifier xmlns="4873beb7-5857-4685-be1f-d57550cc96cc" xsi:nil="true"/>
+    <AssetId xmlns="4873beb7-5857-4685-be1f-d57550cc96cc">TP102787001</AssetId>
+    <PolicheckWords xmlns="4873beb7-5857-4685-be1f-d57550cc96cc" xsi:nil="true"/>
+    <TPLaunchHelpLink xmlns="4873beb7-5857-4685-be1f-d57550cc96cc" xsi:nil="true"/>
+    <IntlLocPriority xmlns="4873beb7-5857-4685-be1f-d57550cc96cc" xsi:nil="true"/>
+    <TPApplication xmlns="4873beb7-5857-4685-be1f-d57550cc96cc" xsi:nil="true"/>
+    <IntlLangReviewer xmlns="4873beb7-5857-4685-be1f-d57550cc96cc" xsi:nil="true"/>
+    <HandoffToMSDN xmlns="4873beb7-5857-4685-be1f-d57550cc96cc" xsi:nil="true"/>
+    <PlannedPubDate xmlns="4873beb7-5857-4685-be1f-d57550cc96cc" xsi:nil="true"/>
+    <CrawlForDependencies xmlns="4873beb7-5857-4685-be1f-d57550cc96cc">false</CrawlForDependencies>
+    <LocLastLocAttemptVersionLookup xmlns="4873beb7-5857-4685-be1f-d57550cc96cc">693888</LocLastLocAttemptVersionLookup>
+    <LocProcessedForHandoffsLookup xmlns="4873beb7-5857-4685-be1f-d57550cc96cc" xsi:nil="true"/>
+    <TrustLevel xmlns="4873beb7-5857-4685-be1f-d57550cc96cc">1 Microsoft Managed Content</TrustLevel>
+    <CampaignTagsTaxHTField0 xmlns="4873beb7-5857-4685-be1f-d57550cc96cc">
+      <Terms xmlns="http://schemas.microsoft.com/office/infopath/2007/PartnerControls"/>
+    </CampaignTagsTaxHTField0>
+    <TPNamespace xmlns="4873beb7-5857-4685-be1f-d57550cc96cc" xsi:nil="true"/>
+    <LocOverallPreviewStatusLookup xmlns="4873beb7-5857-4685-be1f-d57550cc96cc" xsi:nil="true"/>
+    <TaxCatchAll xmlns="4873beb7-5857-4685-be1f-d57550cc96cc"/>
+    <IsSearchable xmlns="4873beb7-5857-4685-be1f-d57550cc96cc">false</IsSearchable>
+    <TemplateTemplateType xmlns="4873beb7-5857-4685-be1f-d57550cc96cc">Word Document Template</TemplateTemplateType>
+    <Markets xmlns="4873beb7-5857-4685-be1f-d57550cc96cc"/>
+    <IntlLangReview xmlns="4873beb7-5857-4685-be1f-d57550cc96cc" xsi:nil="true"/>
+    <UAProjectedTotalWords xmlns="4873beb7-5857-4685-be1f-d57550cc96cc" xsi:nil="true"/>
+    <OutputCachingOn xmlns="4873beb7-5857-4685-be1f-d57550cc96cc">false</OutputCachingOn>
+    <AverageRating xmlns="4873beb7-5857-4685-be1f-d57550cc96cc" xsi:nil="true"/>
+    <LocMarketGroupTiers2 xmlns="4873beb7-5857-4685-be1f-d57550cc96cc" xsi:nil="true"/>
+    <APAuthor xmlns="4873beb7-5857-4685-be1f-d57550cc96cc">
+      <UserInfo>
+        <DisplayName>REDMOND\v-namall</DisplayName>
+        <AccountId>978</AccountId>
+        <AccountType/>
+      </UserInfo>
+    </APAuthor>
+    <TPCommandLine xmlns="4873beb7-5857-4685-be1f-d57550cc96cc" xsi:nil="true"/>
+    <LocManualTestRequired xmlns="4873beb7-5857-4685-be1f-d57550cc96cc">false</LocManualTestRequired>
+    <TPAppVersion xmlns="4873beb7-5857-4685-be1f-d57550cc96cc" xsi:nil="true"/>
+    <EditorialStatus xmlns="4873beb7-5857-4685-be1f-d57550cc96cc">Complete</EditorialStatus>
+    <LocProcessedForMarketsLookup xmlns="4873beb7-5857-4685-be1f-d57550cc96cc" xsi:nil="true"/>
+    <LastModifiedDateTime xmlns="4873beb7-5857-4685-be1f-d57550cc96cc" xsi:nil="true"/>
+    <TPLaunchHelpLinkType xmlns="4873beb7-5857-4685-be1f-d57550cc96cc">Template</TPLaunchHelpLinkType>
+    <ScenarioTagsTaxHTField0 xmlns="4873beb7-5857-4685-be1f-d57550cc96cc">
+      <Terms xmlns="http://schemas.microsoft.com/office/infopath/2007/PartnerControls"/>
+    </ScenarioTagsTaxHTField0>
+    <OriginalRelease xmlns="4873beb7-5857-4685-be1f-d57550cc96cc">14</OriginalRelease>
+    <LocalizationTagsTaxHTField0 xmlns="4873beb7-5857-4685-be1f-d57550cc96cc">
+      <Terms xmlns="http://schemas.microsoft.com/office/infopath/2007/PartnerControls"/>
+    </LocalizationTagsTaxHTField0>
+    <Manager xmlns="4873beb7-5857-4685-be1f-d57550cc96cc" xsi:nil="true"/>
+    <UALocRecommendation xmlns="4873beb7-5857-4685-be1f-d57550cc96cc">Localize</UALocRecommendation>
+    <LocOverallHandbackStatusLookup xmlns="4873beb7-5857-4685-be1f-d57550cc96cc" xsi:nil="true"/>
+    <ArtSampleDocs xmlns="4873beb7-5857-4685-be1f-d57550cc96cc" xsi:nil="true"/>
+    <UACurrentWords xmlns="4873beb7-5857-4685-be1f-d57550cc96cc" xsi:nil="true"/>
+    <ShowIn xmlns="4873beb7-5857-4685-be1f-d57550cc96cc">Show everywhere</ShowIn>
+    <CSXHash xmlns="4873beb7-5857-4685-be1f-d57550cc96cc" xsi:nil="true"/>
+    <VoteCount xmlns="4873beb7-5857-4685-be1f-d57550cc96cc" xsi:nil="true"/>
+    <InternalTagsTaxHTField0 xmlns="4873beb7-5857-4685-be1f-d57550cc96cc">
+      <Terms xmlns="http://schemas.microsoft.com/office/infopath/2007/PartnerControls"/>
+    </InternalTagsTaxHTField0>
+    <UANotes xmlns="4873beb7-5857-4685-be1f-d57550cc96cc" xsi:nil="true"/>
+  </documentManagement>
+</p:properties>
 </file>
 
 <file path=customXml/itemProps1.xml><?xml version="1.0" encoding="utf-8"?>
-<ds:datastoreItem xmlns:ds="http://schemas.openxmlformats.org/officeDocument/2006/customXml" ds:itemID="{7FBDB1CC-CEFB-4E46-8174-1F0AA0D30B24}">
+<ds:datastoreItem xmlns:ds="http://schemas.openxmlformats.org/officeDocument/2006/customXml" ds:itemID="{C01C3C56-10DB-49F7-B061-44D8728D078A}">
   <ds:schemaRefs>
-    <ds:schemaRef ds:uri="http://schemas.microsoft.com/office/2006/metadata/properties"/>
-    <ds:schemaRef ds:uri="http://schemas.microsoft.com/office/infopath/2007/PartnerControls"/>
-    <ds:schemaRef ds:uri="4873beb7-5857-4685-be1f-d57550cc96cc"/>
+    <ds:schemaRef ds:uri="http://schemas.microsoft.com/sharepoint/v3/contenttype/forms"/>
   </ds:schemaRefs>
 </ds:datastoreItem>
 </file>
@@ -4780,9 +4878,11 @@
 </file>
 
 <file path=customXml/itemProps3.xml><?xml version="1.0" encoding="utf-8"?>
-<ds:datastoreItem xmlns:ds="http://schemas.openxmlformats.org/officeDocument/2006/customXml" ds:itemID="{C01C3C56-10DB-49F7-B061-44D8728D078A}">
+<ds:datastoreItem xmlns:ds="http://schemas.openxmlformats.org/officeDocument/2006/customXml" ds:itemID="{7FBDB1CC-CEFB-4E46-8174-1F0AA0D30B24}">
   <ds:schemaRefs>
-    <ds:schemaRef ds:uri="http://schemas.microsoft.com/sharepoint/v3/contenttype/forms"/>
+    <ds:schemaRef ds:uri="http://schemas.microsoft.com/office/2006/metadata/properties"/>
+    <ds:schemaRef ds:uri="http://schemas.microsoft.com/office/infopath/2007/PartnerControls"/>
+    <ds:schemaRef ds:uri="4873beb7-5857-4685-be1f-d57550cc96cc"/>
   </ds:schemaRefs>
 </ds:datastoreItem>
 </file>
</xml_diff>